<commit_message>
feat(workers): dynamic excel export and dropdown table clipping fix
</commit_message>
<xml_diff>
--- a/out.docx
+++ b/out.docx
@@ -1,27 +1,103 @@
 
-<file path=word/document.xml><?xml version="1.0" encoding="UTF-8" standalone="yes"?>
-<w:document xmlns:w="http://schemas.openxmlformats.org/wordprocessingml/2006/main">
-    <w:body>
-        <w:p><w:pPr><w:jc w:val="center"/></w:pPr><w:r><w:rPr><w:b/><w:sz w:val="32"/></w:rPr><w:t xml:space="preserve">TEST POV</w:t></w:r></w:p>
-        
-        
-        <w:p><w:pPr><w:spacing w:before="60" w:after="60"/></w:pPr><w:r><w:rPr><w:b/></w:rPr><w:t xml:space="preserve">1. Q1</w:t></w:r></w:p>
-        
-        
-        <w:p><w:pPr><w:ind w:left="400"/></w:pPr><w:r><w:t xml:space="preserve">a) Opt1</w:t></w:r></w:p>
-        
-        <w:p><w:pPr><w:spacing w:after="120"/></w:pPr></w:p>
-        
-        
-        <w:p><w:pPr><w:spacing w:before="480" w:after="240"/></w:pPr><w:r><w:t>Potpis kandidata: _________________</w:t></w:r></w:p>
-        <w:p><w:r><w:t>Broj tačnih odgovora: ____/____</w:t></w:r></w:p>
-        <w:p><w:r><w:t>Kandidat je:</w:t></w:r></w:p>
-        <w:p><w:r><w:t>a) Položio</w:t></w:r></w:p>
-        <w:p><w:r><w:t>b) Nije položio</w:t></w:r></w:p>
-        <w:p><w:pPr><w:spacing w:before="240"/></w:pPr><w:r><w:t>Stručno lice koje je vršilo obuku i provjeru znanja:</w:t></w:r></w:p>
-        <w:p><w:r><w:t>________________________</w:t></w:r></w:p>
-        <w:sectPr><w:type w:val="continuous"/><w:pgSz w:w="11906" w:h="16838"/><w:pgMar w:top="1134" w:right="720" w:bottom="720" w:left="1134" w:header="57" w:footer="0" w:gutter="0"/><w:pgBorders w:offsetFrom="page"><w:top w:val="single" w:sz="4" w:space="20" w:color="808080" w:themeColor="background1" w:themeShade="80"/><w:left w:val="single" w:sz="4" w:space="20" w:color="808080" w:themeColor="background1" w:themeShade="80"/><w:bottom w:val="single" w:sz="4" w:space="20" w:color="808080" w:themeColor="background1" w:themeShade="80"/><w:right w:val="single" w:sz="4" w:space="20" w:color="808080" w:themeColor="background1" w:themeShade="80"/></w:pgBorders><w:cols w:space="708"/><w:docGrid w:linePitch="360"/></w:sectPr></w:body></w:document>
-    </w:body>
+<file path=word/document.xml><?xml version="1.0" encoding="utf-8"?>
+<w:document xmlns:wpc="http://schemas.microsoft.com/office/word/2010/wordprocessingCanvas" xmlns:cx="http://schemas.microsoft.com/office/drawing/2014/chartex" xmlns:cx1="http://schemas.microsoft.com/office/drawing/2015/9/8/chartex" xmlns:cx2="http://schemas.microsoft.com/office/drawing/2015/10/21/chartex" xmlns:cx3="http://schemas.microsoft.com/office/drawing/2016/5/9/chartex" xmlns:cx4="http://schemas.microsoft.com/office/drawing/2016/5/10/chartex" xmlns:cx5="http://schemas.microsoft.com/office/drawing/2016/5/11/chartex" xmlns:cx6="http://schemas.microsoft.com/office/drawing/2016/5/12/chartex" xmlns:cx7="http://schemas.microsoft.com/office/drawing/2016/5/13/chartex" xmlns:cx8="http://schemas.microsoft.com/office/drawing/2016/5/14/chartex" xmlns:mc="http://schemas.openxmlformats.org/markup-compatibility/2006" xmlns:aink="http://schemas.microsoft.com/office/drawing/2016/ink" xmlns:am3d="http://schemas.microsoft.com/office/drawing/2017/model3d" xmlns:o="urn:schemas-microsoft-com:office:office" xmlns:oel="http://schemas.microsoft.com/office/2019/extlst" xmlns:r="http://schemas.openxmlformats.org/officeDocument/2006/relationships" xmlns:m="http://schemas.openxmlformats.org/officeDocument/2006/math" xmlns:v="urn:schemas-microsoft-com:vml" xmlns:wp14="http://schemas.microsoft.com/office/word/2010/wordprocessingDrawing" xmlns:wp="http://schemas.openxmlformats.org/drawingml/2006/wordprocessingDrawing" xmlns:w10="urn:schemas-microsoft-com:office:word" xmlns:w="http://schemas.openxmlformats.org/wordprocessingml/2006/main" xmlns:w14="http://schemas.microsoft.com/office/word/2010/wordml" xmlns:w15="http://schemas.microsoft.com/office/word/2012/wordml" xmlns:w16cex="http://schemas.microsoft.com/office/word/2018/wordml/cex" xmlns:w16cid="http://schemas.microsoft.com/office/word/2016/wordml/cid" xmlns:w16="http://schemas.microsoft.com/office/word/2018/wordml" xmlns:w16du="http://schemas.microsoft.com/office/word/2023/wordml/word16du" xmlns:w16sdtdh="http://schemas.microsoft.com/office/word/2020/wordml/sdtdatahash" xmlns:w16sdtfl="http://schemas.microsoft.com/office/word/2024/wordml/sdtformatlock" xmlns:w16se="http://schemas.microsoft.com/office/word/2015/wordml/symex" xmlns:wpg="http://schemas.microsoft.com/office/word/2010/wordprocessingGroup" xmlns:wpi="http://schemas.microsoft.com/office/word/2010/wordprocessingInk" xmlns:wne="http://schemas.microsoft.com/office/word/2006/wordml" xmlns:wps="http://schemas.microsoft.com/office/word/2010/wordprocessingShape" mc:Ignorable="w14 w15 w16se w16cid w16 w16cex w16sdtdh w16sdtfl w16du wp14">
+  <w:body>
+    <w:p>
+      <w:pPr>
+        <w:jc w:val="center"/>
+      </w:pPr>
+      <w:r>
+        <w:rPr>
+          <w:b/>
+          <w:sz w:val="32"/>
+        </w:rPr>
+        <w:t xml:space="preserve">TEST POV</w:t>
+      </w:r>
+    </w:p>
+    <w:p>
+      <w:pPr>
+        <w:spacing w:before="60" w:after="60"/>
+      </w:pPr>
+      <w:r>
+        <w:rPr>
+          <w:b/>
+        </w:rPr>
+        <w:t xml:space="preserve">1. Q1</w:t>
+      </w:r>
+    </w:p>
+    <w:p>
+      <w:pPr>
+        <w:ind w:left="400"/>
+      </w:pPr>
+      <w:r>
+        <w:t xml:space="preserve">a) Opt1</w:t>
+      </w:r>
+    </w:p>
+    <w:p>
+      <w:pPr>
+        <w:spacing w:after="120"/>
+      </w:pPr>
+    </w:p>
+    <w:p>
+      <w:pPr>
+        <w:spacing w:before="480" w:after="240"/>
+      </w:pPr>
+      <w:r>
+        <w:t>Potpis kandidata: _________________</w:t>
+      </w:r>
+    </w:p>
+    <w:p>
+      <w:r>
+        <w:t>Broj tačnih odgovora: ____/____</w:t>
+      </w:r>
+    </w:p>
+    <w:p>
+      <w:r>
+        <w:t>Kandidat je:</w:t>
+      </w:r>
+    </w:p>
+    <w:p>
+      <w:r>
+        <w:t>a) Položio</w:t>
+      </w:r>
+    </w:p>
+    <w:p>
+      <w:r>
+        <w:t>b) Nije položio</w:t>
+      </w:r>
+    </w:p>
+    <w:p>
+      <w:pPr>
+        <w:spacing w:before="240"/>
+      </w:pPr>
+      <w:r>
+        <w:t>Stručno lice koje je vršilo obuku i provjeru znanja:</w:t>
+      </w:r>
+    </w:p>
+    <w:p>
+      <w:r>
+        <w:t>________________________</w:t>
+      </w:r>
+    </w:p>
+    <w:sectPr>
+      <w:headerReference w:type="even" r:id="rId7"/>
+      <w:headerReference w:type="default" r:id="rId8"/>
+      <w:footerReference w:type="even" r:id="rId9"/>
+      <w:footerReference w:type="default" r:id="rId10"/>
+      <w:headerReference w:type="first" r:id="rId11"/>
+      <w:footerReference w:type="first" r:id="rId12"/>
+      <w:pgSz w:w="11906" w:h="16838"/>
+      <w:pgMar w:top="1304" w:right="720" w:bottom="720" w:left="1134" w:header="0" w:footer="0" w:gutter="0"/>
+      <w:pgBorders w:offsetFrom="page">
+        <w:top w:val="single" w:sz="4" w:space="20" w:color="808080" w:themeColor="background1" w:themeShade="80"/>
+        <w:left w:val="single" w:sz="4" w:space="20" w:color="808080" w:themeColor="background1" w:themeShade="80"/>
+        <w:bottom w:val="single" w:sz="4" w:space="20" w:color="808080" w:themeColor="background1" w:themeShade="80"/>
+        <w:right w:val="single" w:sz="4" w:space="20" w:color="808080" w:themeColor="background1" w:themeShade="80"/>
+      </w:pgBorders>
+      <w:cols w:space="708"/>
+      <w:docGrid w:linePitch="360"/>
+    </w:sectPr>
+  </w:body>
 </w:document>
 </file>
 

</xml_diff>